<commit_message>
Update VoIP porting plan with Polycom VVX 310 steps
</commit_message>
<xml_diff>
--- a/downloads/nextiva-to-voipms-porting-plan.docx
+++ b/downloads/nextiva-to-voipms-porting-plan.docx
@@ -56,7 +56,7 @@
         <w:pStyle w:val="ListBullet"/>
       </w:pPr>
       <w:r>
-        <w:t>7 numbers will forward to people's cell phones.</w:t>
+        <w:t>7 numbers will forward to people's AT&amp;T cell phones.</w:t>
       </w:r>
     </w:p>
     <w:p>
@@ -72,7 +72,7 @@
         <w:pStyle w:val="ListBullet"/>
       </w:pPr>
       <w:r>
-        <w:t>3 numbers will ring 3 Polycom desk phones.</w:t>
+        <w:t>3 numbers will ring 3 Polycom VVX 310 desk phones.</w:t>
       </w:r>
     </w:p>
     <w:p>
@@ -112,6 +112,14 @@
         <w:pStyle w:val="ListBullet"/>
       </w:pPr>
       <w:r>
+        <w:t>Choose the preferred VoIP.ms server/POP region.</w:t>
+      </w:r>
+    </w:p>
+    <w:p>
+      <w:pPr>
+        <w:pStyle w:val="ListBullet"/>
+      </w:pPr>
+      <w:r>
         <w:t>Configure the 7 cell-phone forwarding routes.</w:t>
       </w:r>
     </w:p>
@@ -128,7 +136,7 @@
         <w:pStyle w:val="ListBullet"/>
       </w:pPr>
       <w:r>
-        <w:t>Create SIP accounts/subaccounts for the 3 Polycom desk phones.</w:t>
+        <w:t>Create one SIP subaccount for each Polycom VVX 310 desk phone.</w:t>
       </w:r>
     </w:p>
     <w:p>
@@ -201,6 +209,70 @@
       </w:pPr>
       <w:r>
         <w:t>Confirmation there is no port freeze, pending order, disconnect order, or account hold.</w:t>
+      </w:r>
+    </w:p>
+    <w:p>
+      <w:pPr>
+        <w:pStyle w:val="Heading2"/>
+      </w:pPr>
+      <w:r>
+        <w:t>Confirm the Polycom VVX 310 phones can be reused</w:t>
+      </w:r>
+    </w:p>
+    <w:p>
+      <w:pPr>
+        <w:pStyle w:val="ListBullet"/>
+      </w:pPr>
+      <w:r>
+        <w:t>Record the MAC address for each VVX 310 before changing anything.</w:t>
+      </w:r>
+    </w:p>
+    <w:p>
+      <w:pPr>
+        <w:pStyle w:val="ListBullet"/>
+      </w:pPr>
+      <w:r>
+        <w:t>Ask Nextiva whether the VVX 310 phones are locked to Nextiva provisioning or can be reused with another SIP provider.</w:t>
+      </w:r>
+    </w:p>
+    <w:p>
+      <w:pPr>
+        <w:pStyle w:val="ListBullet"/>
+      </w:pPr>
+      <w:r>
+        <w:t>Ask Nextiva to remove the phones from Nextiva provisioning/autoprovisioning after the numbers are ported, or confirm the phones will not be remotely reprovisioned back to Nextiva.</w:t>
+      </w:r>
+    </w:p>
+    <w:p>
+      <w:pPr>
+        <w:pStyle w:val="ListBullet"/>
+      </w:pPr>
+      <w:r>
+        <w:t>Factory reset or manually reconfigure each VVX 310 only after you know it can be reused.</w:t>
+      </w:r>
+    </w:p>
+    <w:p>
+      <w:pPr>
+        <w:pStyle w:val="ListBullet"/>
+      </w:pPr>
+      <w:r>
+        <w:t>Configure each VVX 310 with its VoIP.ms SIP subaccount, password, SIP server, and required proxy/NAT settings.</w:t>
+      </w:r>
+    </w:p>
+    <w:p>
+      <w:pPr>
+        <w:pStyle w:val="ListBullet"/>
+      </w:pPr>
+      <w:r>
+        <w:t>Test at least one VVX 310 with VoIP.ms before port day using a temporary DID if possible.</w:t>
+      </w:r>
+    </w:p>
+    <w:p>
+      <w:pPr>
+        <w:pStyle w:val="ListBullet"/>
+      </w:pPr>
+      <w:r>
+        <w:t>Keep a forwarding fallback ready for each desk-phone number in case a phone does not register cleanly on cutover day.</w:t>
       </w:r>
     </w:p>
     <w:p>
@@ -288,7 +360,23 @@
         <w:pStyle w:val="ListBullet"/>
       </w:pPr>
       <w:r>
-        <w:t>Test outbound calling from the Polycom phones.</w:t>
+        <w:t>Test the 7 forwarded numbers to confirm they reach the correct AT&amp;T cell phones.</w:t>
+      </w:r>
+    </w:p>
+    <w:p>
+      <w:pPr>
+        <w:pStyle w:val="ListBullet"/>
+      </w:pPr>
+      <w:r>
+        <w:t>Test outbound calling from each Polycom VVX 310.</w:t>
+      </w:r>
+    </w:p>
+    <w:p>
+      <w:pPr>
+        <w:pStyle w:val="ListBullet"/>
+      </w:pPr>
+      <w:r>
+        <w:t>Test inbound calling to each Polycom VVX 310 number.</w:t>
       </w:r>
     </w:p>
     <w:p>
@@ -297,14 +385,6 @@
       </w:pPr>
       <w:r>
         <w:t>Test fax send and receive.</w:t>
-      </w:r>
-    </w:p>
-    <w:p>
-      <w:pPr>
-        <w:pStyle w:val="ListBullet"/>
-      </w:pPr>
-      <w:r>
-        <w:t>Confirm the 7 forwarded numbers reach the correct cell phones.</w:t>
       </w:r>
     </w:p>
     <w:p>
@@ -356,7 +436,59 @@
         <w:rPr>
           <w:i/>
         </w:rPr>
+        <w:t>"The desk phones are Polycom VVX 310s currently provisioned with Nextiva. Are they locked to Nextiva provisioning, or can they be factory reset and reused with VoIP.ms? After the port completes, please remove them from Nextiva provisioning/autoprovisioning or confirm they will not be remotely reprovisioned back to Nextiva."</w:t>
+      </w:r>
+    </w:p>
+    <w:p>
+      <w:pPr>
+        <w:spacing w:before="120" w:after="120"/>
+        <w:ind w:left="360" w:right="360"/>
+      </w:pPr>
+      <w:r>
+        <w:rPr>
+          <w:i/>
+        </w:rPr>
         <w:t>"While the port is pending, please set temporary call forwarding on these 11 numbers to the temporary VoIP.ms numbers I provide. This is to prevent missed inbound calls before the port completes."</w:t>
+      </w:r>
+    </w:p>
+    <w:p>
+      <w:pPr>
+        <w:pStyle w:val="Heading1"/>
+      </w:pPr>
+      <w:r>
+        <w:t>Polycom VVX 310 Notes</w:t>
+      </w:r>
+    </w:p>
+    <w:p>
+      <w:pPr>
+        <w:pStyle w:val="ListBullet"/>
+      </w:pPr>
+      <w:r>
+        <w:t>A VVX 310 is a SIP desk phone, so it should generally be usable with VoIP.ms if it is not locked or forced back to Nextiva provisioning.</w:t>
+      </w:r>
+    </w:p>
+    <w:p>
+      <w:pPr>
+        <w:pStyle w:val="ListBullet"/>
+      </w:pPr>
+      <w:r>
+        <w:t>If the phone still points to Nextiva provisioning, it may reboot and overwrite manual VoIP.ms settings.</w:t>
+      </w:r>
+    </w:p>
+    <w:p>
+      <w:pPr>
+        <w:pStyle w:val="ListBullet"/>
+      </w:pPr>
+      <w:r>
+        <w:t>Each phone should have its own VoIP.ms SIP subaccount.</w:t>
+      </w:r>
+    </w:p>
+    <w:p>
+      <w:pPr>
+        <w:pStyle w:val="ListBullet"/>
+      </w:pPr>
+      <w:r>
+        <w:t>Do not wait until port day to discover whether the phones can register with VoIP.ms.</w:t>
       </w:r>
     </w:p>
     <w:p>
@@ -369,7 +501,7 @@
     </w:p>
     <w:p>
       <w:r>
-        <w:t>No carrier can honestly guarantee zero disruption, but this process gives you the best shot: configure VoIP.ms first, get the exact CSR from Nextiva, forward calls during the waiting period, port the 11 numbers, test everything, and only then cancel Nextiva.</w:t>
+        <w:t>No carrier can honestly guarantee zero disruption, but this process gives you the best shot: configure VoIP.ms first, get the exact CSR from Nextiva, confirm the VVX 310 phones can be reused, forward calls during the waiting period, port the 11 numbers, test everything, and only then cancel Nextiva.</w:t>
       </w:r>
     </w:p>
     <w:sectPr>
@@ -809,7 +941,7 @@
       <w:outlineLvl w:val="0"/>
     </w:pPr>
     <w:rPr>
-      <w:rFonts w:asciiTheme="majorHAnsi" w:eastAsiaTheme="majorEastAsia" w:hAnsiTheme="majorHAnsi" w:cstheme="majorBidi" w:ascii="Aptos Display" w:hAnsi="Aptos Display"/>
+      <w:rFonts w:asciiTheme="majorHAnsi" w:eastAsiaTheme="majorEastAsia" w:hAnsiTheme="majorHAnsi" w:cstheme="majorBidi" w:ascii="Aptos" w:hAnsi="Aptos"/>
       <w:b/>
       <w:bCs/>
       <w:color w:val="365F91" w:themeColor="accent1" w:themeShade="BF"/>
@@ -1098,7 +1230,7 @@
       <w:contextualSpacing/>
     </w:pPr>
     <w:rPr>
-      <w:rFonts w:asciiTheme="majorHAnsi" w:eastAsiaTheme="majorEastAsia" w:hAnsiTheme="majorHAnsi" w:cstheme="majorBidi" w:ascii="Aptos Display" w:hAnsi="Aptos Display"/>
+      <w:rFonts w:asciiTheme="majorHAnsi" w:eastAsiaTheme="majorEastAsia" w:hAnsiTheme="majorHAnsi" w:cstheme="majorBidi" w:ascii="Aptos" w:hAnsi="Aptos"/>
       <w:color w:val="17365D" w:themeColor="text2" w:themeShade="BF"/>
       <w:spacing w:val="5"/>
       <w:kern w:val="28"/>

</xml_diff>

<commit_message>
Add VVX 310 cold reset requirement
</commit_message>
<xml_diff>
--- a/downloads/nextiva-to-voipms-porting-plan.docx
+++ b/downloads/nextiva-to-voipms-porting-plan.docx
@@ -73,6 +73,14 @@
       </w:pPr>
       <w:r>
         <w:t>3 numbers will ring 3 Polycom VVX 310 desk phones.</w:t>
+      </w:r>
+    </w:p>
+    <w:p>
+      <w:pPr>
+        <w:pStyle w:val="ListBullet"/>
+      </w:pPr>
+      <w:r>
+        <w:t>The VVX 310 phones are provisioned with Nextiva; Nextiva said the only way to release them is to cold reset them.</w:t>
       </w:r>
     </w:p>
     <w:p>
@@ -216,7 +224,7 @@
         <w:pStyle w:val="Heading2"/>
       </w:pPr>
       <w:r>
-        <w:t>Confirm the Polycom VVX 310 phones can be reused</w:t>
+        <w:t>Cold reset and reconfigure the Polycom VVX 310 phones</w:t>
       </w:r>
     </w:p>
     <w:p>
@@ -232,7 +240,7 @@
         <w:pStyle w:val="ListBullet"/>
       </w:pPr>
       <w:r>
-        <w:t>Ask Nextiva whether the VVX 310 phones are locked to Nextiva provisioning or can be reused with another SIP provider.</w:t>
+        <w:t>Record which desk/location each VVX 310 belongs to.</w:t>
       </w:r>
     </w:p>
     <w:p>
@@ -240,7 +248,7 @@
         <w:pStyle w:val="ListBullet"/>
       </w:pPr>
       <w:r>
-        <w:t>Ask Nextiva to remove the phones from Nextiva provisioning/autoprovisioning after the numbers are ported, or confirm the phones will not be remotely reprovisioned back to Nextiva.</w:t>
+        <w:t>Create one VoIP.ms SIP subaccount per VVX 310 before resetting phones.</w:t>
       </w:r>
     </w:p>
     <w:p>
@@ -248,7 +256,7 @@
         <w:pStyle w:val="ListBullet"/>
       </w:pPr>
       <w:r>
-        <w:t>Factory reset or manually reconfigure each VVX 310 only after you know it can be reused.</w:t>
+        <w:t>Keep a temporary forwarding destination ready for each desk-phone number before resetting phones.</w:t>
       </w:r>
     </w:p>
     <w:p>
@@ -256,7 +264,7 @@
         <w:pStyle w:val="ListBullet"/>
       </w:pPr>
       <w:r>
-        <w:t>Configure each VVX 310 with its VoIP.ms SIP subaccount, password, SIP server, and required proxy/NAT settings.</w:t>
+        <w:t>Cold reset one VVX 310 first, not all three at once, if practical.</w:t>
       </w:r>
     </w:p>
     <w:p>
@@ -264,7 +272,7 @@
         <w:pStyle w:val="ListBullet"/>
       </w:pPr>
       <w:r>
-        <w:t>Test at least one VVX 310 with VoIP.ms before port day using a temporary DID if possible.</w:t>
+        <w:t>After the cold reset, configure the phone with its VoIP.ms SIP username, SIP password, SIP server, and required proxy/NAT settings.</w:t>
       </w:r>
     </w:p>
     <w:p>
@@ -272,7 +280,31 @@
         <w:pStyle w:val="ListBullet"/>
       </w:pPr>
       <w:r>
-        <w:t>Keep a forwarding fallback ready for each desk-phone number in case a phone does not register cleanly on cutover day.</w:t>
+        <w:t>Confirm the phone registers to VoIP.ms.</w:t>
+      </w:r>
+    </w:p>
+    <w:p>
+      <w:pPr>
+        <w:pStyle w:val="ListBullet"/>
+      </w:pPr>
+      <w:r>
+        <w:t>Test outbound calling, inbound calling through a temporary DID if available, two-way audio, voicemail/failover, and reboot persistence.</w:t>
+      </w:r>
+    </w:p>
+    <w:p>
+      <w:pPr>
+        <w:pStyle w:val="ListBullet"/>
+      </w:pPr>
+      <w:r>
+        <w:t>Repeat for the other two VVX 310 phones only after the first one is proven.</w:t>
+      </w:r>
+    </w:p>
+    <w:p>
+      <w:pPr>
+        <w:pStyle w:val="ListBullet"/>
+      </w:pPr>
+      <w:r>
+        <w:t>On port day, map each desk-phone DID to the correct VVX 310 SIP subaccount.</w:t>
       </w:r>
     </w:p>
     <w:p>
@@ -436,7 +468,7 @@
         <w:rPr>
           <w:i/>
         </w:rPr>
-        <w:t>"The desk phones are Polycom VVX 310s currently provisioned with Nextiva. Are they locked to Nextiva provisioning, or can they be factory reset and reused with VoIP.ms? After the port completes, please remove them from Nextiva provisioning/autoprovisioning or confirm they will not be remotely reprovisioned back to Nextiva."</w:t>
+        <w:t>"The desk phones are Polycom VVX 310s currently provisioned with Nextiva. You told us the only way to release them is to cold reset them. Please confirm there is no additional provisioning/zero-touch lock that will cause the phones to pull Nextiva settings again after the reset."</w:t>
       </w:r>
     </w:p>
     <w:p>
@@ -456,7 +488,7 @@
         <w:pStyle w:val="Heading1"/>
       </w:pPr>
       <w:r>
-        <w:t>Polycom VVX 310 Notes</w:t>
+        <w:t>Polycom VVX 310 Cold Reset Notes</w:t>
       </w:r>
     </w:p>
     <w:p>
@@ -464,7 +496,7 @@
         <w:pStyle w:val="ListBullet"/>
       </w:pPr>
       <w:r>
-        <w:t>A VVX 310 is a SIP desk phone, so it should generally be usable with VoIP.ms if it is not locked or forced back to Nextiva provisioning.</w:t>
+        <w:t>Factory/cold reset erases the existing Nextiva configuration.</w:t>
       </w:r>
     </w:p>
     <w:p>
@@ -472,7 +504,7 @@
         <w:pStyle w:val="ListBullet"/>
       </w:pPr>
       <w:r>
-        <w:t>If the phone still points to Nextiva provisioning, it may reboot and overwrite manual VoIP.ms settings.</w:t>
+        <w:t>For VVX 300/310/400/410 series phones, common documented reset behavior uses the 1 + 3 + 5 key combination during boot/updater countdown.</w:t>
       </w:r>
     </w:p>
     <w:p>
@@ -480,7 +512,7 @@
         <w:pStyle w:val="ListBullet"/>
       </w:pPr>
       <w:r>
-        <w:t>Each phone should have its own VoIP.ms SIP subaccount.</w:t>
+        <w:t>If prompted for a password, try the known admin password if Nextiva provides one; otherwise the phone MAC address is often used for reset on Polycom VVX devices.</w:t>
       </w:r>
     </w:p>
     <w:p>
@@ -488,7 +520,23 @@
         <w:pStyle w:val="ListBullet"/>
       </w:pPr>
       <w:r>
-        <w:t>Do not wait until port day to discover whether the phones can register with VoIP.ms.</w:t>
+        <w:t>After reset, the default admin password is commonly 456, but confirm on the device.</w:t>
+      </w:r>
+    </w:p>
+    <w:p>
+      <w:pPr>
+        <w:pStyle w:val="ListBullet"/>
+      </w:pPr>
+      <w:r>
+        <w:t>Do not reset all phones at once unless there is already a fallback call path.</w:t>
+      </w:r>
+    </w:p>
+    <w:p>
+      <w:pPr>
+        <w:pStyle w:val="ListBullet"/>
+      </w:pPr>
+      <w:r>
+        <w:t>If the phone still points to Nextiva provisioning or Poly zero-touch provisioning, it may reboot and overwrite manual VoIP.ms settings.</w:t>
       </w:r>
     </w:p>
     <w:p>
@@ -501,7 +549,7 @@
     </w:p>
     <w:p>
       <w:r>
-        <w:t>No carrier can honestly guarantee zero disruption, but this process gives you the best shot: configure VoIP.ms first, get the exact CSR from Nextiva, confirm the VVX 310 phones can be reused, forward calls during the waiting period, port the 11 numbers, test everything, and only then cancel Nextiva.</w:t>
+        <w:t>No carrier can honestly guarantee zero disruption, but this process gives you the best shot: configure VoIP.ms first, get the exact CSR from Nextiva, cold reset and test the VVX 310 phones one at a time, forward calls during the waiting period, port the 11 numbers, test everything, and only then cancel Nextiva.</w:t>
       </w:r>
     </w:p>
     <w:sectPr>

</xml_diff>

<commit_message>
Update VoIP.ms Polycom porting instructions
</commit_message>
<xml_diff>
--- a/downloads/nextiva-to-voipms-porting-plan.docx
+++ b/downloads/nextiva-to-voipms-porting-plan.docx
@@ -26,6 +26,7 @@
       </w:r>
     </w:p>
     <w:p>
+      <w:pPr/>
       <w:r>
         <w:t>Goal: move 11 numbers from Nextiva to VoIP.ms in one coordinated port while keeping service active until everything is tested.</w:t>
       </w:r>
@@ -39,6 +40,7 @@
       </w:r>
     </w:p>
     <w:p>
+      <w:pPr/>
       <w:r>
         <w:t>Do not cancel Nextiva before the port is complete. Port the 11 numbers into VoIP.ms first, keep Nextiva live until the port finishes, test every number, then cancel/remove the other 23 numbers afterward.</w:t>
       </w:r>
@@ -120,7 +122,7 @@
         <w:pStyle w:val="ListBullet"/>
       </w:pPr>
       <w:r>
-        <w:t>Choose the preferred VoIP.ms server/POP region.</w:t>
+        <w:t>Choose the preferred VoIP.ms server/POP region. Use that same server/POP for the desk-phone subaccounts and the DID routing later.</w:t>
       </w:r>
     </w:p>
     <w:p>
@@ -144,7 +146,7 @@
         <w:pStyle w:val="ListBullet"/>
       </w:pPr>
       <w:r>
-        <w:t>Create one SIP subaccount for each Polycom VVX 310 desk phone.</w:t>
+        <w:t>Create one SIP subaccount for each Polycom VVX 310 desk phone before the port completes. Name them by desk/location and final DID, for example Front Desk - 215xxxxxxx.</w:t>
       </w:r>
     </w:p>
     <w:p>
@@ -152,7 +154,15 @@
         <w:pStyle w:val="ListBullet"/>
       </w:pPr>
       <w:r>
-        <w:t>If possible, test the routes with temporary VoIP.ms numbers before the port date.</w:t>
+        <w:t>Set each subaccount caller ID to the final desk-phone DID that will belong to that phone once the port completes.</w:t>
+      </w:r>
+    </w:p>
+    <w:p>
+      <w:pPr>
+        <w:pStyle w:val="ListBullet"/>
+      </w:pPr>
+      <w:r>
+        <w:t>If possible, test the routes and phones with temporary VoIP.ms numbers before the port date.</w:t>
       </w:r>
     </w:p>
     <w:p>
@@ -224,6 +234,54 @@
         <w:pStyle w:val="Heading2"/>
       </w:pPr>
       <w:r>
+        <w:t>When to configure the 3 Polycom VVX 310 phones</w:t>
+      </w:r>
+    </w:p>
+    <w:p>
+      <w:pPr>
+        <w:pStyle w:val="ListBullet"/>
+      </w:pPr>
+      <w:r>
+        <w:t>Do the VoIP.ms portal prep before submitting or while waiting for the port: create the three SIP subaccounts, decide which final DID maps to which physical phone, and document each phone MAC/location.</w:t>
+      </w:r>
+    </w:p>
+    <w:p>
+      <w:pPr>
+        <w:pStyle w:val="ListBullet"/>
+      </w:pPr>
+      <w:r>
+        <w:t>Do not cold reset a phone until you are ready for that physical phone to stop working on Nextiva. A reset removes the Nextiva provisioning/configuration.</w:t>
+      </w:r>
+    </w:p>
+    <w:p>
+      <w:pPr>
+        <w:pStyle w:val="ListBullet"/>
+      </w:pPr>
+      <w:r>
+        <w:t>Best timing: after VoIP.ms accepts the port order and you have a firm FOC/cutover date, configure and test one VVX 310 after hours using a temporary VoIP.ms test DID if available.</w:t>
+      </w:r>
+    </w:p>
+    <w:p>
+      <w:pPr>
+        <w:pStyle w:val="ListBullet"/>
+      </w:pPr>
+      <w:r>
+        <w:t>If the business still depends on the Nextiva phones before cutover, leave the other phones on Nextiva until the first VoIP.ms phone is proven or until the scheduled port window.</w:t>
+      </w:r>
+    </w:p>
+    <w:p>
+      <w:pPr>
+        <w:pStyle w:val="ListBullet"/>
+      </w:pPr>
+      <w:r>
+        <w:t>On the port-completion day, assign each newly ported desk-phone DID to the matching VVX 310 subaccount in VoIP.ms, then test inbound and outbound calls.</w:t>
+      </w:r>
+    </w:p>
+    <w:p>
+      <w:pPr>
+        <w:pStyle w:val="Heading2"/>
+      </w:pPr>
+      <w:r>
         <w:t>Cold reset and reconfigure the Polycom VVX 310 phones</w:t>
       </w:r>
     </w:p>
@@ -240,7 +298,7 @@
         <w:pStyle w:val="ListBullet"/>
       </w:pPr>
       <w:r>
-        <w:t>Record which desk/location each VVX 310 belongs to.</w:t>
+        <w:t>Record which desk/location each VVX 310 belongs to and which final DID it should answer.</w:t>
       </w:r>
     </w:p>
     <w:p>
@@ -272,7 +330,7 @@
         <w:pStyle w:val="ListBullet"/>
       </w:pPr>
       <w:r>
-        <w:t>After the cold reset, configure the phone with its VoIP.ms SIP username, SIP password, SIP server, and required proxy/NAT settings.</w:t>
+        <w:t>After reset, find the phone IP address: Home button -&gt; Settings -&gt; Status -&gt; Network -&gt; TCP/IP Parameters. Open that IP address from a computer on the same network.</w:t>
       </w:r>
     </w:p>
     <w:p>
@@ -280,7 +338,47 @@
         <w:pStyle w:val="ListBullet"/>
       </w:pPr>
       <w:r>
-        <w:t>Confirm the phone registers to VoIP.ms.</w:t>
+        <w:t>Log in to the Polycom web configuration page as admin. The common default admin password after reset is 456 unless the phone firmware or provisioning changed it.</w:t>
+      </w:r>
+    </w:p>
+    <w:p>
+      <w:pPr>
+        <w:pStyle w:val="ListBullet"/>
+      </w:pPr>
+      <w:r>
+        <w:t>Configure Line 1 / SIP identity using the VoIP.ms subaccount created for that phone.</w:t>
+      </w:r>
+    </w:p>
+    <w:p>
+      <w:pPr>
+        <w:pStyle w:val="ListBullet"/>
+      </w:pPr>
+      <w:r>
+        <w:t>Typical VoIP.ms values: Address/User ID = VoIP.ms subaccount username; Authentication User ID = same subaccount username; Authentication Password = that subaccount SIP password; Label/Display Name = desk name or phone number; Server/Registrar = the selected VoIP.ms server; Port = 5060 unless you intentionally use another supported VoIP.ms SIP port.</w:t>
+      </w:r>
+    </w:p>
+    <w:p>
+      <w:pPr>
+        <w:pStyle w:val="ListBullet"/>
+      </w:pPr>
+      <w:r>
+        <w:t>Use the same VoIP.ms server/POP for the phone registration and the DID routing. VoIP.ms notes that the device registration server should match the DID POP for inbound calling.</w:t>
+      </w:r>
+    </w:p>
+    <w:p>
+      <w:pPr>
+        <w:pStyle w:val="ListBullet"/>
+      </w:pPr>
+      <w:r>
+        <w:t>Save/apply settings and let the phone reboot if prompted.</w:t>
+      </w:r>
+    </w:p>
+    <w:p>
+      <w:pPr>
+        <w:pStyle w:val="ListBullet"/>
+      </w:pPr>
+      <w:r>
+        <w:t>Confirm the phone shows registered in VoIP.ms and on the Polycom status screen.</w:t>
       </w:r>
     </w:p>
     <w:p>
@@ -304,7 +402,7 @@
         <w:pStyle w:val="ListBullet"/>
       </w:pPr>
       <w:r>
-        <w:t>On port day, map each desk-phone DID to the correct VVX 310 SIP subaccount.</w:t>
+        <w:t>On port day, route each ported desk-phone DID in VoIP.ms: DID Numbers -&gt; Manage DID(s) -&gt; edit the DID -&gt; Routing -&gt; select the correct SIP subaccount for that Polycom phone.</w:t>
       </w:r>
     </w:p>
     <w:p>
@@ -400,7 +498,15 @@
         <w:pStyle w:val="ListBullet"/>
       </w:pPr>
       <w:r>
-        <w:t>Test outbound calling from each Polycom VVX 310.</w:t>
+        <w:t>In VoIP.ms, confirm each of the 3 desk-phone DIDs is routed to the correct VVX 310 subaccount.</w:t>
+      </w:r>
+    </w:p>
+    <w:p>
+      <w:pPr>
+        <w:pStyle w:val="ListBullet"/>
+      </w:pPr>
+      <w:r>
+        <w:t>Test outbound calling from each Polycom VVX 310 and confirm the expected caller ID appears.</w:t>
       </w:r>
     </w:p>
     <w:p>
@@ -436,50 +542,26 @@
       </w:r>
     </w:p>
     <w:p>
-      <w:pPr>
-        <w:spacing w:before="120" w:after="120"/>
-        <w:ind w:left="360" w:right="360"/>
-      </w:pPr>
+      <w:pPr/>
       <w:r>
-        <w:rPr>
-          <w:i/>
-        </w:rPr>
         <w:t>"I am porting 11 numbers away from Nextiva to a new carrier. Please do not cancel, disconnect, reassign, or modify service yet. I need the Customer Service Record information for these numbers, including the exact business name, service address, account number, BTN, and any port-out PIN or authorization code required. Please also confirm whether all 11 numbers are on the same account/invoice/BTN and whether there are any port freezes, pending orders, account holds, or restrictions that would reject the port."</w:t>
       </w:r>
     </w:p>
     <w:p>
-      <w:pPr>
-        <w:spacing w:before="120" w:after="120"/>
-        <w:ind w:left="360" w:right="360"/>
-      </w:pPr>
+      <w:pPr/>
       <w:r>
-        <w:rPr>
-          <w:i/>
-        </w:rPr>
         <w:t>"I only want these 11 numbers ported out. The remaining 23 numbers should stay active for now until I confirm the port is complete. After the port completes successfully, I will request cancellation/removal of the remaining numbers."</w:t>
       </w:r>
     </w:p>
     <w:p>
-      <w:pPr>
-        <w:spacing w:before="120" w:after="120"/>
-        <w:ind w:left="360" w:right="360"/>
-      </w:pPr>
+      <w:pPr/>
       <w:r>
-        <w:rPr>
-          <w:i/>
-        </w:rPr>
         <w:t>"The desk phones are Polycom VVX 310s currently provisioned with Nextiva. You told us the only way to release them is to cold reset them. Please confirm there is no additional provisioning/zero-touch lock that will cause the phones to pull Nextiva settings again after the reset."</w:t>
       </w:r>
     </w:p>
     <w:p>
-      <w:pPr>
-        <w:spacing w:before="120" w:after="120"/>
-        <w:ind w:left="360" w:right="360"/>
-      </w:pPr>
+      <w:pPr/>
       <w:r>
-        <w:rPr>
-          <w:i/>
-        </w:rPr>
         <w:t>"While the port is pending, please set temporary call forwarding on these 11 numbers to the temporary VoIP.ms numbers I provide. This is to prevent missed inbound calls before the port completes."</w:t>
       </w:r>
     </w:p>
@@ -544,17 +626,66 @@
         <w:pStyle w:val="Heading1"/>
       </w:pPr>
       <w:r>
+        <w:t>VoIP.ms Reference Links</w:t>
+      </w:r>
+    </w:p>
+    <w:p>
+      <w:pPr>
+        <w:pStyle w:val="ListBullet"/>
+      </w:pPr>
+      <w:r>
+        <w:t>Polycom VVX 300/400/etc configuration: https://wiki.voip.ms/article/Polycom_VVX_300%2C_400%2C_etc</w:t>
+      </w:r>
+    </w:p>
+    <w:p>
+      <w:pPr>
+        <w:pStyle w:val="ListBullet"/>
+      </w:pPr>
+      <w:r>
+        <w:t>Subaccounts: https://wiki.voip.ms/article/Sub_Accounts</w:t>
+      </w:r>
+    </w:p>
+    <w:p>
+      <w:pPr>
+        <w:pStyle w:val="ListBullet"/>
+      </w:pPr>
+      <w:r>
+        <w:t>Manage DID routing: https://wiki.voip.ms/article/Manage_DID</w:t>
+      </w:r>
+    </w:p>
+    <w:p>
+      <w:pPr>
+        <w:pStyle w:val="ListBullet"/>
+      </w:pPr>
+      <w:r>
+        <w:t>Call forwarding: https://wiki.voip.ms/article/Call_Forwarding</w:t>
+      </w:r>
+    </w:p>
+    <w:p>
+      <w:pPr>
+        <w:pStyle w:val="ListBullet"/>
+      </w:pPr>
+      <w:r>
+        <w:t>Getting started / routing options: https://wiki.voip.ms/article/Getting_Started</w:t>
+      </w:r>
+    </w:p>
+    <w:p>
+      <w:pPr>
+        <w:pStyle w:val="Heading1"/>
+      </w:pPr>
+      <w:r>
         <w:t>Plain-English Warning</w:t>
       </w:r>
     </w:p>
     <w:p>
+      <w:pPr/>
       <w:r>
-        <w:t>No carrier can honestly guarantee zero disruption, but this process gives you the best shot: configure VoIP.ms first, get the exact CSR from Nextiva, cold reset and test the VVX 310 phones one at a time, forward calls during the waiting period, port the 11 numbers, test everything, and only then cancel Nextiva.</w:t>
+        <w:t>No carrier can honestly guarantee zero disruption, but this process gives you the best shot: configure VoIP.ms first, get the exact CSR from Nextiva, cold reset and test the VVX 310 phones one at a time, forward calls during the waiting period, port the 11 numbers, map the desk-phone DIDs to the correct Polycom subaccounts, test everything, and only then cancel Nextiva.</w:t>
       </w:r>
     </w:p>
     <w:sectPr>
       <w:pgSz w:w="12240" w:h="15840"/>
-      <w:pgMar w:top="1008" w:right="1080" w:bottom="1008" w:left="1080" w:header="720" w:footer="720" w:gutter="0"/>
+      <w:pgMar w:top="1440" w:right="1800" w:bottom="1440" w:left="1800" w:header="720" w:footer="720" w:gutter="0"/>
       <w:cols w:space="720"/>
       <w:docGrid w:linePitch="360"/>
     </w:sectPr>
@@ -989,11 +1120,11 @@
       <w:outlineLvl w:val="0"/>
     </w:pPr>
     <w:rPr>
-      <w:rFonts w:asciiTheme="majorHAnsi" w:eastAsiaTheme="majorEastAsia" w:hAnsiTheme="majorHAnsi" w:cstheme="majorBidi" w:ascii="Aptos" w:hAnsi="Aptos"/>
+      <w:rFonts w:asciiTheme="majorHAnsi" w:eastAsiaTheme="majorEastAsia" w:hAnsiTheme="majorHAnsi" w:cstheme="majorBidi"/>
       <w:b/>
       <w:bCs/>
       <w:color w:val="365F91" w:themeColor="accent1" w:themeShade="BF"/>
-      <w:sz w:val="30"/>
+      <w:sz w:val="28"/>
       <w:szCs w:val="28"/>
     </w:rPr>
   </w:style>
@@ -1013,11 +1144,11 @@
       <w:outlineLvl w:val="1"/>
     </w:pPr>
     <w:rPr>
-      <w:rFonts w:asciiTheme="majorHAnsi" w:eastAsiaTheme="majorEastAsia" w:hAnsiTheme="majorHAnsi" w:cstheme="majorBidi" w:ascii="Aptos" w:hAnsi="Aptos"/>
+      <w:rFonts w:asciiTheme="majorHAnsi" w:eastAsiaTheme="majorEastAsia" w:hAnsiTheme="majorHAnsi" w:cstheme="majorBidi"/>
       <w:b/>
       <w:bCs/>
       <w:color w:val="4F81BD" w:themeColor="accent1"/>
-      <w:sz w:val="24"/>
+      <w:sz w:val="26"/>
       <w:szCs w:val="26"/>
     </w:rPr>
   </w:style>
@@ -1278,11 +1409,11 @@
       <w:contextualSpacing/>
     </w:pPr>
     <w:rPr>
-      <w:rFonts w:asciiTheme="majorHAnsi" w:eastAsiaTheme="majorEastAsia" w:hAnsiTheme="majorHAnsi" w:cstheme="majorBidi" w:ascii="Aptos" w:hAnsi="Aptos"/>
+      <w:rFonts w:asciiTheme="majorHAnsi" w:eastAsiaTheme="majorEastAsia" w:hAnsiTheme="majorHAnsi" w:cstheme="majorBidi"/>
       <w:color w:val="17365D" w:themeColor="text2" w:themeShade="BF"/>
       <w:spacing w:val="5"/>
       <w:kern w:val="28"/>
-      <w:sz w:val="40"/>
+      <w:sz w:val="52"/>
       <w:szCs w:val="52"/>
     </w:rPr>
   </w:style>

</xml_diff>